<commit_message>
Add personnel import wizard and Excel file for leave records
- Introduced a new Python script `personel_import.py` for bulk importing personnel data from Excel files.
- Implemented functionality to normalize personnel records, handle various date formats, and manage errors during import.
- Added a new Excel file containing leave records for personnel as a reference.
</commit_message>
<xml_diff>
--- a/docs/REPYS_Kapsamli_Analiz_Raporu.docx
+++ b/docs/REPYS_Kapsamli_Analiz_Raporu.docx
@@ -10141,6 +10141,12 @@
         </w:rPr>
         <w:t>TKB-04 | Dashboard Cift Implementasyonu</w:t>
       </w:r>
+      <w:r>
+        <w:rPr>
+          <w:noProof/>
+        </w:rPr>
+        <w:t xml:space="preserve"> (TAMAMLANDI)</w:t>
+      </w:r>
     </w:p>
     <w:p>
       <w:pPr>
@@ -10166,6 +10172,12 @@
           <w:noProof/>
         </w:rPr>
         <w:t>TKB-05 | Error Handling Standardizasyonu</w:t>
+      </w:r>
+      <w:r>
+        <w:rPr>
+          <w:noProof/>
+        </w:rPr>
+        <w:t xml:space="preserve"> (TAMAMLANDI)</w:t>
       </w:r>
     </w:p>
     <w:p>

</xml_diff>